<commit_message>
bagian template hapus kop
</commit_message>
<xml_diff>
--- a/storage/app/templates/bap-kolokium-1.docx
+++ b/storage/app/templates/bap-kolokium-1.docx
@@ -1,25 +1,730 @@
 
 <file path=word/document.xml><?xml version="1.0" encoding="utf-8"?>
-<w:document xmlns:wpc="http://schemas.microsoft.com/office/word/2010/wordprocessingCanvas" xmlns:cx="http://schemas.microsoft.com/office/drawing/2014/chartex" xmlns:cx1="http://schemas.microsoft.com/office/drawing/2015/9/8/chartex" xmlns:cx2="http://schemas.microsoft.com/office/drawing/2015/10/21/chartex" xmlns:cx3="http://schemas.microsoft.com/office/drawing/2016/5/9/chartex" xmlns:cx4="http://schemas.microsoft.com/office/drawing/2016/5/10/chartex" xmlns:cx5="http://schemas.microsoft.com/office/drawing/2016/5/11/chartex" xmlns:cx6="http://schemas.microsoft.com/office/drawing/2016/5/12/chartex" xmlns:cx7="http://schemas.microsoft.com/office/drawing/2016/5/13/chartex" xmlns:cx8="http://schemas.microsoft.com/office/drawing/2016/5/14/chartex" xmlns:mc="http://schemas.openxmlformats.org/markup-compatibility/2006" xmlns:aink="http://schemas.microsoft.com/office/drawing/2016/ink" xmlns:am3d="http://schemas.microsoft.com/office/drawing/2017/model3d" xmlns:o="urn:schemas-microsoft-com:office:office" xmlns:oel="http://schemas.microsoft.com/office/2019/extlst" xmlns:r="http://schemas.openxmlformats.org/officeDocument/2006/relationships" xmlns:m="http://schemas.openxmlformats.org/officeDocument/2006/math" xmlns:v="urn:schemas-microsoft-com:vml" xmlns:wp14="http://schemas.microsoft.com/office/word/2010/wordprocessingDrawing" xmlns:wp="http://schemas.openxmlformats.org/drawingml/2006/wordprocessingDrawing" xmlns:w10="urn:schemas-microsoft-com:office:word" xmlns:w="http://schemas.openxmlformats.org/wordprocessingml/2006/main" xmlns:w14="http://schemas.microsoft.com/office/word/2010/wordml" xmlns:w15="http://schemas.microsoft.com/office/word/2012/wordml" xmlns:w16cei="http://schemas.microsoft.com/office/word/2026/wordml/cei" xmlns:w16cex="http://schemas.microsoft.com/office/word/2018/wordml/cex" xmlns:w16cid="http://schemas.microsoft.com/office/word/2016/wordml/cid" xmlns:w16="http://schemas.microsoft.com/office/word/2018/wordml" xmlns:w16du="http://schemas.microsoft.com/office/word/2023/wordml/word16du" xmlns:w16sdtdh="http://schemas.microsoft.com/office/word/2020/wordml/sdtdatahash" xmlns:w16sdtfl="http://schemas.microsoft.com/office/word/2024/wordml/sdtformatlock" xmlns:w16se="http://schemas.microsoft.com/office/word/2015/wordml/symex" xmlns:wpg="http://schemas.microsoft.com/office/word/2010/wordprocessingGroup" xmlns:wpi="http://schemas.microsoft.com/office/word/2010/wordprocessingInk" xmlns:wne="http://schemas.microsoft.com/office/word/2006/wordml" xmlns:wps="http://schemas.microsoft.com/office/word/2010/wordprocessingShape" mc:Ignorable="w14 w15 w16se w16cid w16 w16cex w16sdtdh w16sdtfl w16du wp14">
+<w:document xmlns:wpc="http://schemas.microsoft.com/office/word/2010/wordprocessingCanvas" xmlns:cx="http://schemas.microsoft.com/office/drawing/2014/chartex" xmlns:cx1="http://schemas.microsoft.com/office/drawing/2015/9/8/chartex" xmlns:cx2="http://schemas.microsoft.com/office/drawing/2015/10/21/chartex" xmlns:cx3="http://schemas.microsoft.com/office/drawing/2016/5/9/chartex" xmlns:cx4="http://schemas.microsoft.com/office/drawing/2016/5/10/chartex" xmlns:cx5="http://schemas.microsoft.com/office/drawing/2016/5/11/chartex" xmlns:cx6="http://schemas.microsoft.com/office/drawing/2016/5/12/chartex" xmlns:cx7="http://schemas.microsoft.com/office/drawing/2016/5/13/chartex" xmlns:cx8="http://schemas.microsoft.com/office/drawing/2016/5/14/chartex" xmlns:mc="http://schemas.openxmlformats.org/markup-compatibility/2006" xmlns:aink="http://schemas.microsoft.com/office/drawing/2016/ink" xmlns:am3d="http://schemas.microsoft.com/office/drawing/2017/model3d" xmlns:o="urn:schemas-microsoft-com:office:office" xmlns:oel="http://schemas.microsoft.com/office/2019/extlst" xmlns:r="http://schemas.openxmlformats.org/officeDocument/2006/relationships" xmlns:m="http://schemas.openxmlformats.org/officeDocument/2006/math" xmlns:v="urn:schemas-microsoft-com:vml" xmlns:wp14="http://schemas.microsoft.com/office/word/2010/wordprocessingDrawing" xmlns:wp="http://schemas.openxmlformats.org/drawingml/2006/wordprocessingDrawing" xmlns:w10="urn:schemas-microsoft-com:office:word" xmlns:w="http://schemas.openxmlformats.org/wordprocessingml/2006/main" xmlns:w14="http://schemas.microsoft.com/office/word/2010/wordml" xmlns:w15="http://schemas.microsoft.com/office/word/2012/wordml" xmlns:w16cex="http://schemas.microsoft.com/office/word/2018/wordml/cex" xmlns:w16cid="http://schemas.microsoft.com/office/word/2016/wordml/cid" xmlns:w16="http://schemas.microsoft.com/office/word/2018/wordml" xmlns:w16du="http://schemas.microsoft.com/office/word/2023/wordml/word16du" xmlns:w16sdtdh="http://schemas.microsoft.com/office/word/2020/wordml/sdtdatahash" xmlns:w16sdtfl="http://schemas.microsoft.com/office/word/2024/wordml/sdtformatlock" xmlns:w16se="http://schemas.microsoft.com/office/word/2015/wordml/symex" xmlns:wpg="http://schemas.microsoft.com/office/word/2010/wordprocessingGroup" xmlns:wpi="http://schemas.microsoft.com/office/word/2010/wordprocessingInk" xmlns:wne="http://schemas.microsoft.com/office/word/2006/wordml" xmlns:wps="http://schemas.microsoft.com/office/word/2010/wordprocessingShape" mc:Ignorable="w14 w15 w16se w16cid w16 w16cex w16sdtdh w16sdtfl w16du wp14">
   <w:body>
     <w:p>
       <w:pPr>
+        <w:rPr>
+          <w:rFonts w:ascii="Times New Roman" w:hAnsi="Times New Roman"/>
+          <w:sz w:val="24"/>
+          <w:szCs w:val="24"/>
+        </w:rPr>
+      </w:pPr>
+    </w:p>
+    <w:p>
+      <w:pPr>
+        <w:rPr>
+          <w:rFonts w:cs="Calibri"/>
+          <w:sz w:val="24"/>
+          <w:szCs w:val="24"/>
+          <w:lang w:eastAsia="id-ID"/>
+        </w:rPr>
+      </w:pPr>
+    </w:p>
+    <w:p>
+      <w:pPr>
+        <w:rPr>
+          <w:rFonts w:cs="Calibri"/>
+          <w:sz w:val="24"/>
+          <w:szCs w:val="24"/>
+          <w:lang w:eastAsia="id-ID"/>
+        </w:rPr>
+      </w:pPr>
+    </w:p>
+    <w:p>
+      <w:pPr>
         <w:spacing w:after="0" w:line="240" w:lineRule="auto"/>
         <w:rPr>
           <w:rFonts w:ascii="Times New Roman" w:hAnsi="Times New Roman"/>
-          <w:sz w:val="24"/>
-          <w:szCs w:val="24"/>
+          <w:color w:val="000000"/>
+          <w:sz w:val="24"/>
         </w:rPr>
       </w:pPr>
       <w:r>
         <w:rPr>
           <w:rFonts w:cs="Calibri"/>
+          <w:sz w:val="24"/>
+          <w:szCs w:val="24"/>
+          <w:lang w:eastAsia="id-ID"/>
+        </w:rPr>
+        <w:tab/>
+      </w:r>
+    </w:p>
+    <w:p>
+      <w:pPr>
+        <w:tabs>
+          <w:tab w:val="left" w:pos="5245"/>
+        </w:tabs>
+        <w:spacing w:after="0"/>
+        <w:ind w:left="4253"/>
+        <w:rPr>
+          <w:rFonts w:ascii="Times New Roman" w:hAnsi="Times New Roman"/>
+          <w:color w:val="000000"/>
+          <w:sz w:val="24"/>
+        </w:rPr>
+      </w:pPr>
+      <w:r>
+        <w:rPr>
+          <w:rFonts w:ascii="Times New Roman" w:hAnsi="Times New Roman"/>
+          <w:color w:val="000000"/>
+          <w:sz w:val="24"/>
+        </w:rPr>
+        <w:t xml:space="preserve">    </w:t>
+      </w:r>
+      <w:r>
+        <w:rPr>
+          <w:rFonts w:ascii="Times New Roman" w:hAnsi="Times New Roman"/>
+          <w:color w:val="000000"/>
+          <w:sz w:val="24"/>
+        </w:rPr>
+        <w:tab/>
+      </w:r>
+      <w:r>
+        <w:rPr>
+          <w:rFonts w:ascii="Times New Roman" w:hAnsi="Times New Roman"/>
+          <w:color w:val="000000"/>
+          <w:sz w:val="24"/>
+        </w:rPr>
+        <w:tab/>
+      </w:r>
+    </w:p>
+    <w:p>
+      <w:pPr>
+        <w:spacing w:after="0" w:line="240" w:lineRule="auto"/>
+        <w:jc w:val="center"/>
+        <w:rPr>
+          <w:rFonts w:ascii="Times New Roman" w:hAnsi="Times New Roman"/>
+          <w:b/>
+          <w:bCs/>
+          <w:sz w:val="28"/>
+          <w:szCs w:val="28"/>
+        </w:rPr>
+      </w:pPr>
+      <w:r>
+        <w:rPr>
+          <w:rFonts w:ascii="Times New Roman" w:hAnsi="Times New Roman"/>
+          <w:b/>
+          <w:bCs/>
+          <w:sz w:val="28"/>
+          <w:szCs w:val="28"/>
+        </w:rPr>
+        <w:t>BERITA ACARA PELAKSANAAN</w:t>
+      </w:r>
+    </w:p>
+    <w:p>
+      <w:pPr>
+        <w:jc w:val="center"/>
+        <w:rPr>
+          <w:rFonts w:ascii="Times New Roman" w:hAnsi="Times New Roman"/>
+          <w:b/>
+          <w:bCs/>
+          <w:sz w:val="28"/>
+          <w:szCs w:val="28"/>
+        </w:rPr>
+      </w:pPr>
+      <w:r>
+        <w:rPr>
+          <w:rFonts w:ascii="Times New Roman" w:hAnsi="Times New Roman"/>
+          <w:b/>
+          <w:bCs/>
+          <w:sz w:val="28"/>
+          <w:szCs w:val="28"/>
+        </w:rPr>
+        <w:t>KOLOKIUM MAHASISWA</w:t>
+      </w:r>
+    </w:p>
+    <w:p>
+      <w:pPr>
+        <w:spacing w:line="360" w:lineRule="auto"/>
+        <w:jc w:val="center"/>
+        <w:rPr>
+          <w:rFonts w:ascii="Times New Roman" w:hAnsi="Times New Roman"/>
+          <w:b/>
+          <w:bCs/>
+          <w:sz w:val="28"/>
+          <w:szCs w:val="28"/>
+        </w:rPr>
+      </w:pPr>
+    </w:p>
+    <w:p>
+      <w:pPr>
+        <w:spacing w:after="240" w:line="360" w:lineRule="auto"/>
+        <w:ind w:left="270" w:right="425"/>
+        <w:jc w:val="both"/>
+        <w:rPr>
+          <w:rFonts w:ascii="Times New Roman" w:hAnsi="Times New Roman"/>
+          <w:sz w:val="24"/>
+          <w:szCs w:val="24"/>
+          <w:lang w:val="en-US"/>
+        </w:rPr>
+      </w:pPr>
+      <w:r>
+        <w:rPr>
+          <w:rFonts w:ascii="Times New Roman" w:hAnsi="Times New Roman"/>
+          <w:sz w:val="24"/>
+          <w:szCs w:val="24"/>
+        </w:rPr>
+        <w:t>Pada hari</w:t>
+      </w:r>
+      <w:r>
+        <w:rPr>
+          <w:rFonts w:ascii="Times New Roman" w:hAnsi="Times New Roman"/>
+          <w:sz w:val="24"/>
+          <w:szCs w:val="24"/>
+        </w:rPr>
+        <w:t xml:space="preserve"> </w:t>
+      </w:r>
+      <w:r>
+        <w:rPr>
+          <w:rFonts w:ascii="Times New Roman" w:hAnsi="Times New Roman"/>
+          <w:sz w:val="24"/>
+          <w:szCs w:val="24"/>
+        </w:rPr>
+        <w:t>${hari}</w:t>
+      </w:r>
+      <w:r>
+        <w:rPr>
+          <w:rFonts w:ascii="Times New Roman" w:hAnsi="Times New Roman"/>
+          <w:sz w:val="24"/>
+          <w:szCs w:val="24"/>
+        </w:rPr>
+        <w:t xml:space="preserve"> </w:t>
+      </w:r>
+      <w:r>
+        <w:rPr>
+          <w:rFonts w:ascii="Times New Roman" w:hAnsi="Times New Roman"/>
+          <w:sz w:val="24"/>
+          <w:szCs w:val="24"/>
+        </w:rPr>
+        <w:t>tanggal</w:t>
+      </w:r>
+      <w:r>
+        <w:rPr>
+          <w:rFonts w:ascii="Times New Roman" w:hAnsi="Times New Roman"/>
+          <w:sz w:val="24"/>
+          <w:szCs w:val="24"/>
+        </w:rPr>
+        <w:t>,</w:t>
+      </w:r>
+      <w:r>
+        <w:rPr>
+          <w:rFonts w:ascii="Times New Roman" w:hAnsi="Times New Roman"/>
+          <w:sz w:val="24"/>
+          <w:szCs w:val="24"/>
+          <w:lang w:val="en-US"/>
+        </w:rPr>
+        <w:t xml:space="preserve"> </w:t>
+      </w:r>
+      <w:r>
+        <w:rPr>
+          <w:rFonts w:ascii="Times New Roman" w:hAnsi="Times New Roman"/>
+          <w:sz w:val="24"/>
+          <w:szCs w:val="24"/>
+          <w:lang w:val="en-US"/>
+        </w:rPr>
+        <w:t>${</w:t>
+      </w:r>
+      <w:proofErr w:type="spellStart"/>
+      <w:r>
+        <w:rPr>
+          <w:rFonts w:ascii="Times New Roman" w:hAnsi="Times New Roman"/>
+          <w:sz w:val="24"/>
+          <w:szCs w:val="24"/>
+          <w:lang w:val="en-US"/>
+        </w:rPr>
+        <w:t>tanggal</w:t>
+      </w:r>
+      <w:proofErr w:type="spellEnd"/>
+      <w:r>
+        <w:rPr>
+          <w:rFonts w:ascii="Times New Roman" w:hAnsi="Times New Roman"/>
+          <w:sz w:val="24"/>
+          <w:szCs w:val="24"/>
+          <w:lang w:val="en-US"/>
+        </w:rPr>
+        <w:t>}</w:t>
+      </w:r>
+      <w:r>
+        <w:rPr>
+          <w:rFonts w:ascii="Times New Roman" w:hAnsi="Times New Roman"/>
+          <w:sz w:val="24"/>
+          <w:szCs w:val="24"/>
+          <w:lang w:val="en-US"/>
+        </w:rPr>
+        <w:t xml:space="preserve"> </w:t>
+      </w:r>
+      <w:r>
+        <w:rPr>
+          <w:rFonts w:ascii="Times New Roman" w:hAnsi="Times New Roman"/>
+          <w:sz w:val="24"/>
+          <w:szCs w:val="24"/>
+        </w:rPr>
+        <w:t xml:space="preserve">telah berlangsung </w:t>
+      </w:r>
+      <w:r>
+        <w:rPr>
+          <w:rFonts w:ascii="Times New Roman" w:hAnsi="Times New Roman"/>
+          <w:b/>
+          <w:bCs/>
+          <w:sz w:val="24"/>
+          <w:szCs w:val="24"/>
+        </w:rPr>
+        <w:t>Kolokium</w:t>
+      </w:r>
+      <w:r>
+        <w:rPr>
+          <w:rFonts w:ascii="Times New Roman" w:hAnsi="Times New Roman"/>
+          <w:b/>
+          <w:bCs/>
+          <w:sz w:val="24"/>
+          <w:szCs w:val="24"/>
+        </w:rPr>
+        <w:t xml:space="preserve"> </w:t>
+      </w:r>
+      <w:r>
+        <w:rPr>
+          <w:rFonts w:ascii="Times New Roman" w:hAnsi="Times New Roman"/>
+          <w:b/>
+          <w:bCs/>
+          <w:sz w:val="24"/>
+          <w:szCs w:val="24"/>
+        </w:rPr>
+        <w:t>Rencana Penelitian</w:t>
+      </w:r>
+      <w:r>
+        <w:rPr>
+          <w:rFonts w:ascii="Times New Roman" w:hAnsi="Times New Roman"/>
+          <w:sz w:val="24"/>
+          <w:szCs w:val="24"/>
+        </w:rPr>
+        <w:t xml:space="preserve"> Semester</w:t>
+      </w:r>
+      <w:r>
+        <w:rPr>
+          <w:rFonts w:ascii="Times New Roman" w:hAnsi="Times New Roman"/>
+          <w:sz w:val="24"/>
+          <w:szCs w:val="24"/>
+        </w:rPr>
+        <w:t xml:space="preserve"> ${semester} </w:t>
+      </w:r>
+      <w:r>
+        <w:rPr>
+          <w:rFonts w:ascii="Times New Roman" w:hAnsi="Times New Roman"/>
+          <w:sz w:val="24"/>
+          <w:szCs w:val="24"/>
+        </w:rPr>
+        <w:t xml:space="preserve">tahun akademik </w:t>
+      </w:r>
+      <w:r>
+        <w:rPr>
+          <w:rFonts w:ascii="Times New Roman" w:hAnsi="Times New Roman"/>
+          <w:sz w:val="24"/>
+          <w:szCs w:val="24"/>
+        </w:rPr>
+        <w:t>${</w:t>
+      </w:r>
+      <w:proofErr w:type="spellStart"/>
+      <w:r>
+        <w:rPr>
+          <w:rFonts w:ascii="Times New Roman" w:hAnsi="Times New Roman"/>
+          <w:sz w:val="24"/>
+          <w:szCs w:val="24"/>
+        </w:rPr>
+        <w:t>tahun_akademik</w:t>
+      </w:r>
+      <w:proofErr w:type="spellEnd"/>
+      <w:r>
+        <w:rPr>
+          <w:rFonts w:ascii="Times New Roman" w:hAnsi="Times New Roman"/>
+          <w:sz w:val="24"/>
+          <w:szCs w:val="24"/>
+        </w:rPr>
+        <w:t>}</w:t>
+      </w:r>
+      <w:r>
+        <w:rPr>
+          <w:rFonts w:ascii="Times New Roman" w:hAnsi="Times New Roman"/>
+          <w:sz w:val="24"/>
+          <w:szCs w:val="24"/>
+          <w:lang w:val="en-US"/>
+        </w:rPr>
+        <w:t>.</w:t>
+      </w:r>
+    </w:p>
+    <w:p>
+      <w:pPr>
+        <w:tabs>
+          <w:tab w:val="left" w:pos="2790"/>
+          <w:tab w:val="left" w:pos="2970"/>
+          <w:tab w:val="left" w:pos="3402"/>
+          <w:tab w:val="left" w:leader="dot" w:pos="8221"/>
+        </w:tabs>
+        <w:spacing w:after="0" w:line="360" w:lineRule="auto"/>
+        <w:ind w:left="567" w:right="425" w:hanging="297"/>
+        <w:jc w:val="both"/>
+        <w:rPr>
+          <w:rFonts w:ascii="Times New Roman" w:hAnsi="Times New Roman"/>
+          <w:bCs/>
+          <w:sz w:val="24"/>
+          <w:szCs w:val="24"/>
+          <w:lang w:val="en-US"/>
+        </w:rPr>
+      </w:pPr>
+      <w:r>
+        <w:rPr>
+          <w:rFonts w:ascii="Times New Roman" w:hAnsi="Times New Roman"/>
+          <w:sz w:val="24"/>
+          <w:szCs w:val="24"/>
+        </w:rPr>
+        <w:t>Nama Mahasiswa</w:t>
+      </w:r>
+      <w:r>
+        <w:rPr>
+          <w:rFonts w:ascii="Times New Roman" w:hAnsi="Times New Roman"/>
+          <w:sz w:val="24"/>
+          <w:szCs w:val="24"/>
+        </w:rPr>
+        <w:tab/>
+        <w:t>:</w:t>
+      </w:r>
+      <w:r>
+        <w:rPr>
+          <w:rFonts w:ascii="Times New Roman" w:hAnsi="Times New Roman"/>
+          <w:sz w:val="24"/>
+          <w:szCs w:val="24"/>
+          <w:lang w:val="en-US"/>
+        </w:rPr>
+        <w:t xml:space="preserve"> </w:t>
+      </w:r>
+      <w:r>
+        <w:rPr>
+          <w:rFonts w:ascii="Times New Roman" w:hAnsi="Times New Roman"/>
+          <w:sz w:val="24"/>
+          <w:szCs w:val="24"/>
+          <w:lang w:val="en-US"/>
+        </w:rPr>
+        <w:t xml:space="preserve"> </w:t>
+      </w:r>
+      <w:r>
+        <w:rPr>
+          <w:rFonts w:ascii="Times New Roman" w:hAnsi="Times New Roman"/>
+          <w:sz w:val="24"/>
+          <w:szCs w:val="24"/>
+          <w:lang w:val="en-US"/>
+        </w:rPr>
+        <w:t>${nama}</w:t>
+      </w:r>
+    </w:p>
+    <w:p>
+      <w:pPr>
+        <w:tabs>
+          <w:tab w:val="left" w:pos="2790"/>
+          <w:tab w:val="left" w:pos="2970"/>
+          <w:tab w:val="left" w:pos="3402"/>
+          <w:tab w:val="left" w:leader="dot" w:pos="8221"/>
+        </w:tabs>
+        <w:spacing w:after="0" w:line="360" w:lineRule="auto"/>
+        <w:ind w:left="567" w:right="425" w:hanging="297"/>
+        <w:jc w:val="both"/>
+        <w:rPr>
+          <w:rFonts w:ascii="Times New Roman" w:hAnsi="Times New Roman"/>
+          <w:bCs/>
+          <w:sz w:val="24"/>
+          <w:szCs w:val="24"/>
+          <w:lang w:val="en-US"/>
+        </w:rPr>
+      </w:pPr>
+      <w:r>
+        <w:rPr>
+          <w:rFonts w:ascii="Times New Roman" w:hAnsi="Times New Roman"/>
+          <w:bCs/>
+          <w:sz w:val="24"/>
+          <w:szCs w:val="24"/>
+        </w:rPr>
+        <w:t>NIM</w:t>
+      </w:r>
+      <w:r>
+        <w:rPr>
+          <w:rFonts w:ascii="Times New Roman" w:hAnsi="Times New Roman"/>
+          <w:bCs/>
+          <w:sz w:val="24"/>
+          <w:szCs w:val="24"/>
+        </w:rPr>
+        <w:tab/>
+        <w:t>:</w:t>
+      </w:r>
+      <w:r>
+        <w:rPr>
+          <w:rFonts w:ascii="Times New Roman" w:hAnsi="Times New Roman"/>
+          <w:bCs/>
+          <w:sz w:val="24"/>
+          <w:szCs w:val="24"/>
+        </w:rPr>
+        <w:tab/>
+      </w:r>
+      <w:r>
+        <w:rPr>
+          <w:rFonts w:ascii="Times New Roman" w:hAnsi="Times New Roman"/>
+          <w:sz w:val="24"/>
+          <w:szCs w:val="24"/>
+          <w:lang w:val="en-US"/>
+        </w:rPr>
+        <w:t>${nim}</w:t>
+      </w:r>
+    </w:p>
+    <w:p>
+      <w:pPr>
+        <w:tabs>
+          <w:tab w:val="left" w:pos="2790"/>
+          <w:tab w:val="left" w:pos="2970"/>
+          <w:tab w:val="left" w:pos="3402"/>
+          <w:tab w:val="left" w:leader="dot" w:pos="8221"/>
+        </w:tabs>
+        <w:spacing w:after="0" w:line="360" w:lineRule="auto"/>
+        <w:ind w:left="2970" w:right="425" w:hanging="2700"/>
+        <w:jc w:val="both"/>
+        <w:rPr>
+          <w:rFonts w:ascii="Times New Roman" w:hAnsi="Times New Roman"/>
+          <w:sz w:val="24"/>
+          <w:szCs w:val="24"/>
+          <w:lang w:val="en-US"/>
+        </w:rPr>
+      </w:pPr>
+      <w:r>
+        <w:rPr>
+          <w:rFonts w:ascii="Times New Roman" w:hAnsi="Times New Roman"/>
+          <w:bCs/>
+          <w:sz w:val="24"/>
+          <w:szCs w:val="24"/>
+        </w:rPr>
+        <w:t xml:space="preserve">Judul </w:t>
+      </w:r>
+      <w:r>
+        <w:rPr>
+          <w:rFonts w:ascii="Times New Roman" w:hAnsi="Times New Roman"/>
+          <w:bCs/>
+          <w:sz w:val="24"/>
+          <w:szCs w:val="24"/>
+        </w:rPr>
+        <w:t>Proposal</w:t>
+      </w:r>
+      <w:r>
+        <w:rPr>
+          <w:rFonts w:ascii="Times New Roman" w:hAnsi="Times New Roman"/>
+          <w:bCs/>
+          <w:sz w:val="24"/>
+          <w:szCs w:val="24"/>
+        </w:rPr>
+        <w:tab/>
+        <w:t>:</w:t>
+      </w:r>
+      <w:r>
+        <w:rPr>
+          <w:rFonts w:ascii="Times New Roman" w:hAnsi="Times New Roman"/>
+          <w:bCs/>
+          <w:sz w:val="24"/>
+          <w:szCs w:val="24"/>
+        </w:rPr>
+        <w:tab/>
+      </w:r>
+      <w:r>
+        <w:rPr>
+          <w:rFonts w:ascii="Times New Roman" w:hAnsi="Times New Roman"/>
+          <w:sz w:val="24"/>
+          <w:szCs w:val="24"/>
+          <w:lang w:val="en-US"/>
+        </w:rPr>
+        <w:t>${</w:t>
+      </w:r>
+      <w:proofErr w:type="spellStart"/>
+      <w:r>
+        <w:rPr>
+          <w:rFonts w:ascii="Times New Roman" w:hAnsi="Times New Roman"/>
+          <w:sz w:val="24"/>
+          <w:szCs w:val="24"/>
+          <w:lang w:val="en-US"/>
+        </w:rPr>
+        <w:t>judul_proposal</w:t>
+      </w:r>
+      <w:proofErr w:type="spellEnd"/>
+      <w:r>
+        <w:rPr>
+          <w:rFonts w:ascii="Times New Roman" w:hAnsi="Times New Roman"/>
+          <w:sz w:val="24"/>
+          <w:szCs w:val="24"/>
+          <w:lang w:val="en-US"/>
+        </w:rPr>
+        <w:t>}</w:t>
+      </w:r>
+    </w:p>
+    <w:p>
+      <w:pPr>
+        <w:tabs>
+          <w:tab w:val="left" w:pos="2790"/>
+          <w:tab w:val="left" w:pos="2970"/>
+          <w:tab w:val="left" w:pos="3402"/>
+          <w:tab w:val="left" w:leader="dot" w:pos="8221"/>
+        </w:tabs>
+        <w:spacing w:after="0" w:line="360" w:lineRule="auto"/>
+        <w:ind w:left="2970" w:right="425" w:hanging="2700"/>
+        <w:jc w:val="both"/>
+        <w:rPr>
+          <w:rFonts w:ascii="Times New Roman" w:hAnsi="Times New Roman"/>
+          <w:sz w:val="24"/>
+          <w:szCs w:val="24"/>
+        </w:rPr>
+      </w:pPr>
+      <w:r>
+        <w:rPr>
+          <w:rFonts w:ascii="Times New Roman" w:hAnsi="Times New Roman"/>
+          <w:bCs/>
+          <w:sz w:val="24"/>
+          <w:szCs w:val="24"/>
+        </w:rPr>
+        <w:t>Waktu</w:t>
+      </w:r>
+      <w:r>
+        <w:rPr>
+          <w:rFonts w:ascii="Times New Roman" w:hAnsi="Times New Roman"/>
+          <w:bCs/>
+          <w:sz w:val="24"/>
+          <w:szCs w:val="24"/>
+        </w:rPr>
+        <w:tab/>
+        <w:t>:</w:t>
+      </w:r>
+      <w:r>
+        <w:rPr>
+          <w:rFonts w:ascii="Times New Roman" w:hAnsi="Times New Roman"/>
+          <w:bCs/>
+          <w:sz w:val="24"/>
+          <w:szCs w:val="24"/>
+        </w:rPr>
+        <w:tab/>
+      </w:r>
+      <w:r>
+        <w:rPr>
+          <w:rFonts w:ascii="Times New Roman" w:hAnsi="Times New Roman"/>
+          <w:sz w:val="24"/>
+          <w:szCs w:val="24"/>
+          <w:lang w:val="en-US"/>
+        </w:rPr>
+        <w:t>${</w:t>
+      </w:r>
+      <w:proofErr w:type="spellStart"/>
+      <w:r>
+        <w:rPr>
+          <w:rFonts w:ascii="Times New Roman" w:hAnsi="Times New Roman"/>
+          <w:sz w:val="24"/>
+          <w:szCs w:val="24"/>
+          <w:lang w:val="en-US"/>
+        </w:rPr>
+        <w:t>waktu</w:t>
+      </w:r>
+      <w:proofErr w:type="spellEnd"/>
+      <w:r>
+        <w:rPr>
+          <w:rFonts w:ascii="Times New Roman" w:hAnsi="Times New Roman"/>
+          <w:sz w:val="24"/>
+          <w:szCs w:val="24"/>
+          <w:lang w:val="en-US"/>
+        </w:rPr>
+        <w:t>}</w:t>
+      </w:r>
+    </w:p>
+    <w:p>
+      <w:pPr>
+        <w:tabs>
+          <w:tab w:val="left" w:pos="2790"/>
+          <w:tab w:val="left" w:pos="2970"/>
+          <w:tab w:val="left" w:pos="3402"/>
+          <w:tab w:val="left" w:leader="dot" w:pos="8221"/>
+        </w:tabs>
+        <w:spacing w:after="240" w:line="360" w:lineRule="auto"/>
+        <w:ind w:left="567" w:right="425" w:hanging="297"/>
+        <w:rPr>
+          <w:rFonts w:ascii="Times New Roman" w:eastAsia="Times New Roman" w:hAnsi="Times New Roman"/>
+          <w:lang w:val="en-US"/>
+        </w:rPr>
+      </w:pPr>
+      <w:r>
+        <w:rPr>
+          <w:rFonts w:ascii="Times New Roman" w:hAnsi="Times New Roman"/>
+          <w:sz w:val="24"/>
+          <w:szCs w:val="24"/>
+        </w:rPr>
+        <w:t>Tempat</w:t>
+      </w:r>
+      <w:r>
+        <w:rPr>
+          <w:rFonts w:ascii="Times New Roman" w:hAnsi="Times New Roman"/>
+          <w:sz w:val="24"/>
+          <w:szCs w:val="24"/>
+        </w:rPr>
+        <w:tab/>
+        <w:t>:</w:t>
+      </w:r>
+      <w:r>
+        <w:rPr>
+          <w:rFonts w:ascii="Times New Roman" w:hAnsi="Times New Roman"/>
+          <w:sz w:val="24"/>
+          <w:szCs w:val="24"/>
+        </w:rPr>
+        <w:tab/>
+      </w:r>
+      <w:r>
+        <w:rPr>
+          <w:rFonts w:ascii="Times New Roman" w:hAnsi="Times New Roman"/>
+          <w:sz w:val="24"/>
+          <w:szCs w:val="24"/>
+          <w:lang w:val="en-US"/>
+        </w:rPr>
+        <w:t>${</w:t>
+      </w:r>
+      <w:proofErr w:type="spellStart"/>
+      <w:r>
+        <w:rPr>
+          <w:rFonts w:ascii="Times New Roman" w:hAnsi="Times New Roman"/>
+          <w:sz w:val="24"/>
+          <w:szCs w:val="24"/>
+          <w:lang w:val="en-US"/>
+        </w:rPr>
+        <w:t>tempat</w:t>
+      </w:r>
+      <w:proofErr w:type="spellEnd"/>
+      <w:r>
+        <w:rPr>
+          <w:rFonts w:ascii="Times New Roman" w:hAnsi="Times New Roman"/>
+          <w:sz w:val="24"/>
+          <w:szCs w:val="24"/>
+          <w:lang w:val="en-US"/>
+        </w:rPr>
+        <w:t>}</w:t>
+      </w:r>
+    </w:p>
+    <w:p>
+      <w:pPr>
+        <w:tabs>
+          <w:tab w:val="left" w:pos="2790"/>
+          <w:tab w:val="left" w:pos="2970"/>
+          <w:tab w:val="left" w:pos="3402"/>
+          <w:tab w:val="left" w:leader="dot" w:pos="8221"/>
+        </w:tabs>
+        <w:spacing w:after="240" w:line="240" w:lineRule="auto"/>
+        <w:ind w:left="576" w:right="432" w:hanging="302"/>
+        <w:rPr>
+          <w:rFonts w:ascii="Times New Roman" w:eastAsia="Times New Roman" w:hAnsi="Times New Roman"/>
+          <w:lang w:val="en-US"/>
+        </w:rPr>
+      </w:pPr>
+      <w:r>
+        <w:rPr>
+          <w:rFonts w:ascii="Times New Roman" w:hAnsi="Times New Roman"/>
           <w:noProof/>
-          <w:sz w:val="24"/>
-          <w:szCs w:val="24"/>
-          <w:lang w:eastAsia="id-ID"/>
-        </w:rPr>
-        <w:pict w14:anchorId="44B4AC87">
+          <w:color w:val="000000"/>
+          <w:lang w:val="en-US"/>
+        </w:rPr>
+        <w:pict w14:anchorId="083FC1C9">
           <v:shapetype id="_x0000_t75" coordsize="21600,21600" o:spt="75" o:preferrelative="t" path="m@4@5l@4@11@9@11@9@5xe" filled="f" stroked="f">
             <v:stroke joinstyle="miter"/>
             <v:formulas>
@@ -39,1035 +744,8 @@
             <v:path o:extrusionok="f" gradientshapeok="t" o:connecttype="rect"/>
             <o:lock v:ext="edit" aspectratio="t"/>
           </v:shapetype>
-          <v:shape id="Picture 17" o:spid="_x0000_s1039" type="#_x0000_t75" alt="Description: ppri662013_statuta_LOGO" style="position:absolute;margin-left:-28.7pt;margin-top:16.9pt;width:57pt;height:57pt;z-index:2;visibility:visible">
-            <v:imagedata r:id="rId6" o:title="ppri662013_statuta_LOGO"/>
-          </v:shape>
-        </w:pict>
-      </w:r>
-    </w:p>
-    <w:p>
-      <w:pPr>
-        <w:spacing w:after="0" w:line="240" w:lineRule="auto"/>
-        <w:ind w:left="1418" w:right="1559"/>
-        <w:rPr>
-          <w:rFonts w:cs="Calibri"/>
-          <w:sz w:val="24"/>
-          <w:szCs w:val="24"/>
-          <w:lang w:eastAsia="id-ID"/>
-        </w:rPr>
-      </w:pPr>
-      <w:r>
-        <w:rPr>
-          <w:rFonts w:cs="Calibri"/>
-          <w:noProof/>
-          <w:sz w:val="24"/>
-          <w:szCs w:val="24"/>
-          <w:lang w:eastAsia="id-ID"/>
-        </w:rPr>
-        <w:pict w14:anchorId="624B89B0">
-          <v:shapetype id="_x0000_t202" coordsize="21600,21600" o:spt="202" path="m,l,21600r21600,l21600,xe">
-            <v:stroke joinstyle="miter"/>
-            <v:path gradientshapeok="t" o:connecttype="rect"/>
-          </v:shapetype>
-          <v:shape id="Text Box 2" o:spid="_x0000_s1040" type="#_x0000_t202" style="position:absolute;left:0;text-align:left;margin-left:29.05pt;margin-top:1.6pt;width:314.1pt;height:66.1pt;z-index:3;visibility:visible" o:gfxdata="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" stroked="f">
-            <v:textbox>
-              <w:txbxContent>
-                <w:p>
-                  <w:pPr>
-                    <w:spacing w:after="0" w:line="240" w:lineRule="auto"/>
-                    <w:rPr>
-                      <w:rFonts w:ascii="Barmeno Regular" w:hAnsi="Barmeno Regular"/>
-                      <w:bCs/>
-                      <w:spacing w:val="4"/>
-                      <w:sz w:val="20"/>
-                      <w:szCs w:val="20"/>
-                      <w:lang w:val="en-US"/>
-                    </w:rPr>
-                  </w:pPr>
-                  <w:r>
-                    <w:rPr>
-                      <w:rFonts w:ascii="Barmeno Regular" w:hAnsi="Barmeno Regular"/>
-                      <w:bCs/>
-                      <w:spacing w:val="4"/>
-                      <w:sz w:val="20"/>
-                      <w:szCs w:val="20"/>
-                      <w:lang w:val="en-US"/>
-                    </w:rPr>
-                    <w:t>KEMENTERIAN PENDIDIKAN, KEBUDAYAAN, RISET, DAN TEKNOLOGI</w:t>
-                  </w:r>
-                </w:p>
-                <w:p>
-                  <w:pPr>
-                    <w:spacing w:after="0" w:line="240" w:lineRule="auto"/>
-                    <w:rPr>
-                      <w:rFonts w:ascii="Barmeno Regular" w:hAnsi="Barmeno Regular"/>
-                      <w:b/>
-                      <w:sz w:val="46"/>
-                      <w:szCs w:val="46"/>
-                    </w:rPr>
-                  </w:pPr>
-                  <w:r>
-                    <w:rPr>
-                      <w:rFonts w:ascii="Barmeno Regular" w:hAnsi="Barmeno Regular"/>
-                      <w:b/>
-                      <w:sz w:val="46"/>
-                      <w:szCs w:val="46"/>
-                    </w:rPr>
-                    <w:t>INSTITUT PERTANIAN BOGOR</w:t>
-                  </w:r>
-                </w:p>
-                <w:p>
-                  <w:pPr>
-                    <w:spacing w:after="0" w:line="240" w:lineRule="auto"/>
-                    <w:rPr>
-                      <w:rFonts w:ascii="Barmeno Regular" w:hAnsi="Barmeno Regular"/>
-                      <w:color w:val="808080"/>
-                      <w:sz w:val="28"/>
-                      <w:szCs w:val="28"/>
-                    </w:rPr>
-                  </w:pPr>
-                  <w:r>
-                    <w:rPr>
-                      <w:rFonts w:ascii="Barmeno Regular" w:hAnsi="Barmeno Regular"/>
-                      <w:color w:val="808080"/>
-                      <w:sz w:val="28"/>
-                      <w:szCs w:val="28"/>
-                    </w:rPr>
-                    <w:t>FAKULTAS KEHUTANAN DAN LINGKUNGAN</w:t>
-                  </w:r>
-                </w:p>
-                <w:p>
-                  <w:pPr>
-                    <w:spacing w:after="0" w:line="240" w:lineRule="auto"/>
-                    <w:rPr>
-                      <w:rFonts w:ascii="Barmeno Regular" w:hAnsi="Barmeno Regular"/>
-                      <w:sz w:val="28"/>
-                      <w:szCs w:val="28"/>
-                    </w:rPr>
-                  </w:pPr>
-                </w:p>
-              </w:txbxContent>
-            </v:textbox>
-          </v:shape>
-        </w:pict>
-      </w:r>
-      <w:r>
-        <w:rPr>
-          <w:rFonts w:cs="Calibri"/>
-          <w:noProof/>
-          <w:sz w:val="24"/>
-          <w:szCs w:val="24"/>
-          <w:lang w:eastAsia="id-ID"/>
-        </w:rPr>
-        <w:pict w14:anchorId="06EE0C31">
-          <v:shape id="_x0000_s1042" type="#_x0000_t202" style="position:absolute;left:0;text-align:left;margin-left:349.3pt;margin-top:1.75pt;width:206.85pt;height:66.05pt;z-index:5;visibility:visible" o:gfxdata="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" stroked="f">
-            <v:textbox>
-              <w:txbxContent>
-                <w:p>
-                  <w:pPr>
-                    <w:spacing w:after="0" w:line="240" w:lineRule="auto"/>
-                    <w:rPr>
-                      <w:rFonts w:ascii="Barmeno Regular" w:hAnsi="Barmeno Regular" w:cs="Calibri"/>
-                      <w:b/>
-                      <w:sz w:val="20"/>
-                      <w:szCs w:val="16"/>
-                    </w:rPr>
-                  </w:pPr>
-                  <w:r>
-                    <w:rPr>
-                      <w:rFonts w:ascii="Barmeno Regular" w:hAnsi="Barmeno Regular" w:cs="Calibri"/>
-                      <w:b/>
-                      <w:sz w:val="20"/>
-                      <w:szCs w:val="16"/>
-                    </w:rPr>
-                    <w:t>DEPARTEMEN SILVIKULTUR</w:t>
-                  </w:r>
-                </w:p>
-                <w:p>
-                  <w:pPr>
-                    <w:spacing w:after="0" w:line="240" w:lineRule="auto"/>
-                    <w:rPr>
-                      <w:rFonts w:ascii="Barmeno Regular" w:hAnsi="Barmeno Regular" w:cs="Calibri"/>
-                      <w:sz w:val="20"/>
-                      <w:szCs w:val="16"/>
-                    </w:rPr>
-                  </w:pPr>
-                  <w:r>
-                    <w:rPr>
-                      <w:rFonts w:ascii="Barmeno Regular" w:hAnsi="Barmeno Regular" w:cs="Calibri"/>
-                      <w:sz w:val="20"/>
-                      <w:szCs w:val="16"/>
-                    </w:rPr>
-                    <w:t>Kampus IPB Dramaga, Bogor 16680</w:t>
-                  </w:r>
-                </w:p>
-                <w:p>
-                  <w:pPr>
-                    <w:tabs>
-                      <w:tab w:val="left" w:pos="851"/>
-                    </w:tabs>
-                    <w:spacing w:after="0" w:line="240" w:lineRule="auto"/>
-                    <w:rPr>
-                      <w:rFonts w:ascii="Barmeno Regular" w:hAnsi="Barmeno Regular" w:cs="Calibri"/>
-                      <w:sz w:val="20"/>
-                      <w:szCs w:val="16"/>
-                    </w:rPr>
-                  </w:pPr>
-                  <w:r>
-                    <w:rPr>
-                      <w:rFonts w:ascii="Barmeno Regular" w:hAnsi="Barmeno Regular" w:cs="Calibri"/>
-                      <w:sz w:val="20"/>
-                      <w:szCs w:val="16"/>
-                    </w:rPr>
-                    <w:t>Telepon</w:t>
-                  </w:r>
-                  <w:r>
-                    <w:rPr>
-                      <w:rFonts w:ascii="Barmeno Regular" w:hAnsi="Barmeno Regular" w:cs="Calibri"/>
-                      <w:sz w:val="20"/>
-                      <w:szCs w:val="16"/>
-                    </w:rPr>
-                    <w:tab/>
-                    <w:t>+62 251 862 6806</w:t>
-                  </w:r>
-                </w:p>
-                <w:p>
-                  <w:pPr>
-                    <w:tabs>
-                      <w:tab w:val="left" w:pos="851"/>
-                    </w:tabs>
-                    <w:spacing w:after="0" w:line="240" w:lineRule="auto"/>
-                    <w:rPr>
-                      <w:rFonts w:ascii="Barmeno Regular" w:hAnsi="Barmeno Regular" w:cs="Calibri"/>
-                      <w:sz w:val="20"/>
-                      <w:szCs w:val="16"/>
-                    </w:rPr>
-                  </w:pPr>
-                  <w:r>
-                    <w:rPr>
-                      <w:rFonts w:ascii="Barmeno Regular" w:hAnsi="Barmeno Regular" w:cs="Calibri"/>
-                      <w:sz w:val="20"/>
-                      <w:szCs w:val="16"/>
-                    </w:rPr>
-                    <w:t>Facsimile</w:t>
-                  </w:r>
-                  <w:r>
-                    <w:rPr>
-                      <w:rFonts w:ascii="Barmeno Regular" w:hAnsi="Barmeno Regular" w:cs="Calibri"/>
-                      <w:sz w:val="20"/>
-                      <w:szCs w:val="16"/>
-                    </w:rPr>
-                    <w:tab/>
-                    <w:t>+62 251 862 6886</w:t>
-                  </w:r>
-                </w:p>
-                <w:p>
-                  <w:pPr>
-                    <w:tabs>
-                      <w:tab w:val="left" w:pos="851"/>
-                    </w:tabs>
-                    <w:spacing w:after="0" w:line="240" w:lineRule="auto"/>
-                    <w:rPr>
-                      <w:rFonts w:ascii="Barmeno Regular" w:hAnsi="Barmeno Regular" w:cs="Calibri"/>
-                      <w:color w:val="0070C0"/>
-                      <w:sz w:val="16"/>
-                      <w:szCs w:val="16"/>
-                      <w:u w:val="single"/>
-                    </w:rPr>
-                  </w:pPr>
-                  <w:hyperlink r:id="rId7" w:history="1">
-                    <w:r>
-                      <w:rPr>
-                        <w:rFonts w:ascii="Barmeno Regular" w:hAnsi="Barmeno Regular" w:cs="Calibri"/>
-                        <w:color w:val="0070C0"/>
-                        <w:sz w:val="16"/>
-                        <w:szCs w:val="16"/>
-                        <w:u w:val="single"/>
-                      </w:rPr>
-                      <w:t>silvikultur@apps.ipb.ac.id</w:t>
-                    </w:r>
-                  </w:hyperlink>
-                  <w:r>
-                    <w:rPr>
-                      <w:rFonts w:ascii="Barmeno Regular" w:hAnsi="Barmeno Regular" w:cs="Calibri"/>
-                      <w:sz w:val="16"/>
-                      <w:szCs w:val="16"/>
-                    </w:rPr>
-                    <w:t xml:space="preserve">  </w:t>
-                  </w:r>
-                  <w:r>
-                    <w:rPr>
-                      <w:rFonts w:ascii="Barmeno Regular" w:hAnsi="Barmeno Regular" w:cs="Calibri"/>
-                      <w:color w:val="0070C0"/>
-                      <w:sz w:val="16"/>
-                      <w:szCs w:val="16"/>
-                      <w:u w:val="single"/>
-                    </w:rPr>
-                    <w:t>silvikultur.fahutan.ipb.ac.id</w:t>
-                  </w:r>
-                </w:p>
-                <w:p>
-                  <w:pPr>
-                    <w:spacing w:after="0"/>
-                    <w:rPr>
-                      <w:rFonts w:ascii="Barmeno Regular" w:hAnsi="Barmeno Regular" w:cs="Calibri"/>
-                      <w:sz w:val="16"/>
-                      <w:szCs w:val="16"/>
-                    </w:rPr>
-                  </w:pPr>
-                  <w:r>
-                    <w:rPr>
-                      <w:rFonts w:ascii="Barmeno Regular" w:hAnsi="Barmeno Regular" w:cs="Calibri"/>
-                      <w:sz w:val="16"/>
-                      <w:szCs w:val="16"/>
-                    </w:rPr>
-                    <w:t xml:space="preserve">     </w:t>
-                  </w:r>
-                </w:p>
-              </w:txbxContent>
-            </v:textbox>
-          </v:shape>
-        </w:pict>
-      </w:r>
-      <w:r>
-        <w:rPr>
-          <w:rFonts w:cs="Calibri"/>
-          <w:noProof/>
-          <w:sz w:val="24"/>
-          <w:szCs w:val="24"/>
-          <w:lang w:eastAsia="id-ID"/>
-        </w:rPr>
-        <w:pict w14:anchorId="755672D0">
-          <v:line id="Straight Connector 1" o:spid="_x0000_s1041" style="position:absolute;left:0;text-align:left;z-index:4;visibility:visible" from="347.05pt,10pt" to="347.05pt,61.65pt" o:gfxdata="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" strokeweight=".03pt"/>
-        </w:pict>
-      </w:r>
-      <w:r>
-        <w:rPr>
-          <w:noProof/>
-        </w:rPr>
-        <w:pict w14:anchorId="107F8C8D">
-          <v:rect id="Rectangle 6" o:spid="_x0000_s1026" style="position:absolute;left:0;text-align:left;margin-left:-91.55pt;margin-top:279.15pt;width:21pt;height:435.75pt;z-index:1;visibility:visible;mso-width-relative:margin;mso-height-relative:margin;v-text-anchor:middle" o:gfxdata="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" fillcolor="#003f77" stroked="f" strokeweight="2pt">
-            <v:fill color2="#0072ce" rotate="t" angle="180" colors="0 #003f77;.5 #005fad;1 #0072ce" focus="100%" type="gradient"/>
-          </v:rect>
-        </w:pict>
-      </w:r>
-    </w:p>
-    <w:p>
-      <w:pPr>
-        <w:rPr>
-          <w:rFonts w:cs="Calibri"/>
-          <w:sz w:val="24"/>
-          <w:szCs w:val="24"/>
-          <w:lang w:eastAsia="id-ID"/>
-        </w:rPr>
-      </w:pPr>
-    </w:p>
-    <w:p>
-      <w:pPr>
-        <w:rPr>
-          <w:rFonts w:cs="Calibri"/>
-          <w:sz w:val="24"/>
-          <w:szCs w:val="24"/>
-          <w:lang w:eastAsia="id-ID"/>
-        </w:rPr>
-      </w:pPr>
-    </w:p>
-    <w:p>
-      <w:pPr>
-        <w:spacing w:after="0" w:line="240" w:lineRule="auto"/>
-        <w:rPr>
-          <w:rFonts w:ascii="Times New Roman" w:hAnsi="Times New Roman"/>
-          <w:color w:val="000000"/>
-          <w:sz w:val="24"/>
-        </w:rPr>
-      </w:pPr>
-      <w:r>
-        <w:rPr>
-          <w:rFonts w:cs="Calibri"/>
-          <w:sz w:val="24"/>
-          <w:szCs w:val="24"/>
-          <w:lang w:eastAsia="id-ID"/>
-        </w:rPr>
-        <w:tab/>
-      </w:r>
-    </w:p>
-    <w:p>
-      <w:pPr>
-        <w:tabs>
-          <w:tab w:val="left" w:pos="5245"/>
-        </w:tabs>
-        <w:spacing w:after="0"/>
-        <w:ind w:left="4253"/>
-        <w:rPr>
-          <w:rFonts w:ascii="Times New Roman" w:hAnsi="Times New Roman"/>
-          <w:color w:val="000000"/>
-          <w:sz w:val="24"/>
-        </w:rPr>
-      </w:pPr>
-      <w:r>
-        <w:rPr>
-          <w:rFonts w:ascii="Times New Roman" w:hAnsi="Times New Roman"/>
-          <w:color w:val="000000"/>
-          <w:sz w:val="24"/>
-        </w:rPr>
-        <w:t xml:space="preserve">    </w:t>
-      </w:r>
-      <w:r>
-        <w:rPr>
-          <w:rFonts w:ascii="Times New Roman" w:hAnsi="Times New Roman"/>
-          <w:color w:val="000000"/>
-          <w:sz w:val="24"/>
-        </w:rPr>
-        <w:tab/>
-      </w:r>
-      <w:r>
-        <w:rPr>
-          <w:rFonts w:ascii="Times New Roman" w:hAnsi="Times New Roman"/>
-          <w:color w:val="000000"/>
-          <w:sz w:val="24"/>
-        </w:rPr>
-        <w:tab/>
-      </w:r>
-    </w:p>
-    <w:p>
-      <w:pPr>
-        <w:spacing w:after="0" w:line="240" w:lineRule="auto"/>
-        <w:jc w:val="center"/>
-        <w:rPr>
-          <w:rFonts w:ascii="Times New Roman" w:hAnsi="Times New Roman"/>
-          <w:b/>
-          <w:bCs/>
-          <w:sz w:val="28"/>
-          <w:szCs w:val="28"/>
-        </w:rPr>
-      </w:pPr>
-      <w:r>
-        <w:rPr>
-          <w:rFonts w:ascii="Times New Roman" w:hAnsi="Times New Roman"/>
-          <w:b/>
-          <w:bCs/>
-          <w:sz w:val="28"/>
-          <w:szCs w:val="28"/>
-        </w:rPr>
-        <w:t>BERITA ACARA PELAKSANAAN</w:t>
-      </w:r>
-    </w:p>
-    <w:p>
-      <w:pPr>
-        <w:jc w:val="center"/>
-        <w:rPr>
-          <w:rFonts w:ascii="Times New Roman" w:hAnsi="Times New Roman"/>
-          <w:b/>
-          <w:bCs/>
-          <w:sz w:val="28"/>
-          <w:szCs w:val="28"/>
-        </w:rPr>
-      </w:pPr>
-      <w:r>
-        <w:rPr>
-          <w:rFonts w:ascii="Times New Roman" w:hAnsi="Times New Roman"/>
-          <w:b/>
-          <w:bCs/>
-          <w:sz w:val="28"/>
-          <w:szCs w:val="28"/>
-        </w:rPr>
-        <w:t>KOLOKIUM MAHASISWA</w:t>
-      </w:r>
-    </w:p>
-    <w:p>
-      <w:pPr>
-        <w:spacing w:line="360" w:lineRule="auto"/>
-        <w:jc w:val="center"/>
-        <w:rPr>
-          <w:rFonts w:ascii="Times New Roman" w:hAnsi="Times New Roman"/>
-          <w:b/>
-          <w:bCs/>
-          <w:sz w:val="28"/>
-          <w:szCs w:val="28"/>
-        </w:rPr>
-      </w:pPr>
-    </w:p>
-    <w:p>
-      <w:pPr>
-        <w:spacing w:after="240" w:line="360" w:lineRule="auto"/>
-        <w:ind w:left="270" w:right="425"/>
-        <w:jc w:val="both"/>
-        <w:rPr>
-          <w:rFonts w:ascii="Times New Roman" w:hAnsi="Times New Roman"/>
-          <w:sz w:val="24"/>
-          <w:szCs w:val="24"/>
-          <w:lang w:val="en-US"/>
-        </w:rPr>
-      </w:pPr>
-      <w:r>
-        <w:rPr>
-          <w:rFonts w:ascii="Times New Roman" w:hAnsi="Times New Roman"/>
-          <w:sz w:val="24"/>
-          <w:szCs w:val="24"/>
-        </w:rPr>
-        <w:t>Pada hari</w:t>
-      </w:r>
-      <w:r>
-        <w:rPr>
-          <w:rFonts w:ascii="Times New Roman" w:hAnsi="Times New Roman"/>
-          <w:sz w:val="24"/>
-          <w:szCs w:val="24"/>
-        </w:rPr>
-        <w:t xml:space="preserve"> </w:t>
-      </w:r>
-      <w:r>
-        <w:rPr>
-          <w:rFonts w:ascii="Times New Roman" w:hAnsi="Times New Roman"/>
-          <w:sz w:val="24"/>
-          <w:szCs w:val="24"/>
-        </w:rPr>
-        <w:t>${hari}</w:t>
-      </w:r>
-      <w:r>
-        <w:rPr>
-          <w:rFonts w:ascii="Times New Roman" w:hAnsi="Times New Roman"/>
-          <w:sz w:val="24"/>
-          <w:szCs w:val="24"/>
-        </w:rPr>
-        <w:t xml:space="preserve"> </w:t>
-      </w:r>
-      <w:r>
-        <w:rPr>
-          <w:rFonts w:ascii="Times New Roman" w:hAnsi="Times New Roman"/>
-          <w:sz w:val="24"/>
-          <w:szCs w:val="24"/>
-        </w:rPr>
-        <w:t>tanggal</w:t>
-      </w:r>
-      <w:r>
-        <w:rPr>
-          <w:rFonts w:ascii="Times New Roman" w:hAnsi="Times New Roman"/>
-          <w:sz w:val="24"/>
-          <w:szCs w:val="24"/>
-        </w:rPr>
-        <w:t>,</w:t>
-      </w:r>
-      <w:r>
-        <w:rPr>
-          <w:rFonts w:ascii="Times New Roman" w:hAnsi="Times New Roman"/>
-          <w:sz w:val="24"/>
-          <w:szCs w:val="24"/>
-          <w:lang w:val="en-US"/>
-        </w:rPr>
-        <w:t xml:space="preserve"> </w:t>
-      </w:r>
-      <w:r>
-        <w:rPr>
-          <w:rFonts w:ascii="Times New Roman" w:hAnsi="Times New Roman"/>
-          <w:sz w:val="24"/>
-          <w:szCs w:val="24"/>
-          <w:lang w:val="en-US"/>
-        </w:rPr>
-        <w:t>${</w:t>
-      </w:r>
-      <w:proofErr w:type="spellStart"/>
-      <w:r>
-        <w:rPr>
-          <w:rFonts w:ascii="Times New Roman" w:hAnsi="Times New Roman"/>
-          <w:sz w:val="24"/>
-          <w:szCs w:val="24"/>
-          <w:lang w:val="en-US"/>
-        </w:rPr>
-        <w:t>tanggal</w:t>
-      </w:r>
-      <w:proofErr w:type="spellEnd"/>
-      <w:r>
-        <w:rPr>
-          <w:rFonts w:ascii="Times New Roman" w:hAnsi="Times New Roman"/>
-          <w:sz w:val="24"/>
-          <w:szCs w:val="24"/>
-          <w:lang w:val="en-US"/>
-        </w:rPr>
-        <w:t>}</w:t>
-      </w:r>
-      <w:r>
-        <w:rPr>
-          <w:rFonts w:ascii="Times New Roman" w:hAnsi="Times New Roman"/>
-          <w:sz w:val="24"/>
-          <w:szCs w:val="24"/>
-          <w:lang w:val="en-US"/>
-        </w:rPr>
-        <w:t xml:space="preserve"> </w:t>
-      </w:r>
-      <w:r>
-        <w:rPr>
-          <w:rFonts w:ascii="Times New Roman" w:hAnsi="Times New Roman"/>
-          <w:sz w:val="24"/>
-          <w:szCs w:val="24"/>
-        </w:rPr>
-        <w:t xml:space="preserve">telah berlangsung </w:t>
-      </w:r>
-      <w:r>
-        <w:rPr>
-          <w:rFonts w:ascii="Times New Roman" w:hAnsi="Times New Roman"/>
-          <w:b/>
-          <w:bCs/>
-          <w:sz w:val="24"/>
-          <w:szCs w:val="24"/>
-        </w:rPr>
-        <w:t>Kolokium</w:t>
-      </w:r>
-      <w:r>
-        <w:rPr>
-          <w:rFonts w:ascii="Times New Roman" w:hAnsi="Times New Roman"/>
-          <w:b/>
-          <w:bCs/>
-          <w:sz w:val="24"/>
-          <w:szCs w:val="24"/>
-        </w:rPr>
-        <w:t xml:space="preserve"> </w:t>
-      </w:r>
-      <w:r>
-        <w:rPr>
-          <w:rFonts w:ascii="Times New Roman" w:hAnsi="Times New Roman"/>
-          <w:b/>
-          <w:bCs/>
-          <w:sz w:val="24"/>
-          <w:szCs w:val="24"/>
-        </w:rPr>
-        <w:t>Rencana Penelitian</w:t>
-      </w:r>
-      <w:r>
-        <w:rPr>
-          <w:rFonts w:ascii="Times New Roman" w:hAnsi="Times New Roman"/>
-          <w:sz w:val="24"/>
-          <w:szCs w:val="24"/>
-        </w:rPr>
-        <w:t xml:space="preserve"> Semester</w:t>
-      </w:r>
-      <w:r>
-        <w:rPr>
-          <w:rFonts w:ascii="Times New Roman" w:hAnsi="Times New Roman"/>
-          <w:sz w:val="24"/>
-          <w:szCs w:val="24"/>
-        </w:rPr>
-        <w:t xml:space="preserve"> ${semester} </w:t>
-      </w:r>
-      <w:r>
-        <w:rPr>
-          <w:rFonts w:ascii="Times New Roman" w:hAnsi="Times New Roman"/>
-          <w:sz w:val="24"/>
-          <w:szCs w:val="24"/>
-        </w:rPr>
-        <w:t xml:space="preserve">tahun akademik </w:t>
-      </w:r>
-      <w:r>
-        <w:rPr>
-          <w:rFonts w:ascii="Times New Roman" w:hAnsi="Times New Roman"/>
-          <w:sz w:val="24"/>
-          <w:szCs w:val="24"/>
-        </w:rPr>
-        <w:t>${</w:t>
-      </w:r>
-      <w:proofErr w:type="spellStart"/>
-      <w:r>
-        <w:rPr>
-          <w:rFonts w:ascii="Times New Roman" w:hAnsi="Times New Roman"/>
-          <w:sz w:val="24"/>
-          <w:szCs w:val="24"/>
-        </w:rPr>
-        <w:t>tahun_akademik</w:t>
-      </w:r>
-      <w:proofErr w:type="spellEnd"/>
-      <w:r>
-        <w:rPr>
-          <w:rFonts w:ascii="Times New Roman" w:hAnsi="Times New Roman"/>
-          <w:sz w:val="24"/>
-          <w:szCs w:val="24"/>
-        </w:rPr>
-        <w:t>}</w:t>
-      </w:r>
-      <w:r>
-        <w:rPr>
-          <w:rFonts w:ascii="Times New Roman" w:hAnsi="Times New Roman"/>
-          <w:sz w:val="24"/>
-          <w:szCs w:val="24"/>
-          <w:lang w:val="en-US"/>
-        </w:rPr>
-        <w:t>.</w:t>
-      </w:r>
-    </w:p>
-    <w:p>
-      <w:pPr>
-        <w:tabs>
-          <w:tab w:val="left" w:pos="2790"/>
-          <w:tab w:val="left" w:pos="2970"/>
-          <w:tab w:val="left" w:pos="3402"/>
-          <w:tab w:val="left" w:leader="dot" w:pos="8221"/>
-        </w:tabs>
-        <w:spacing w:after="0" w:line="360" w:lineRule="auto"/>
-        <w:ind w:left="567" w:right="425" w:hanging="297"/>
-        <w:jc w:val="both"/>
-        <w:rPr>
-          <w:rFonts w:ascii="Times New Roman" w:hAnsi="Times New Roman"/>
-          <w:bCs/>
-          <w:sz w:val="24"/>
-          <w:szCs w:val="24"/>
-          <w:lang w:val="en-US"/>
-        </w:rPr>
-      </w:pPr>
-      <w:r>
-        <w:rPr>
-          <w:rFonts w:ascii="Times New Roman" w:hAnsi="Times New Roman"/>
-          <w:sz w:val="24"/>
-          <w:szCs w:val="24"/>
-        </w:rPr>
-        <w:t>Nama Mahasiswa</w:t>
-      </w:r>
-      <w:r>
-        <w:rPr>
-          <w:rFonts w:ascii="Times New Roman" w:hAnsi="Times New Roman"/>
-          <w:sz w:val="24"/>
-          <w:szCs w:val="24"/>
-        </w:rPr>
-        <w:tab/>
-        <w:t>:</w:t>
-      </w:r>
-      <w:r>
-        <w:rPr>
-          <w:rFonts w:ascii="Times New Roman" w:hAnsi="Times New Roman"/>
-          <w:sz w:val="24"/>
-          <w:szCs w:val="24"/>
-          <w:lang w:val="en-US"/>
-        </w:rPr>
-        <w:t xml:space="preserve"> </w:t>
-      </w:r>
-      <w:r>
-        <w:rPr>
-          <w:rFonts w:ascii="Times New Roman" w:hAnsi="Times New Roman"/>
-          <w:sz w:val="24"/>
-          <w:szCs w:val="24"/>
-          <w:lang w:val="en-US"/>
-        </w:rPr>
-        <w:t xml:space="preserve"> </w:t>
-      </w:r>
-      <w:r>
-        <w:rPr>
-          <w:rFonts w:ascii="Times New Roman" w:hAnsi="Times New Roman"/>
-          <w:sz w:val="24"/>
-          <w:szCs w:val="24"/>
-          <w:lang w:val="en-US"/>
-        </w:rPr>
-        <w:t>${nama}</w:t>
-      </w:r>
-    </w:p>
-    <w:p>
-      <w:pPr>
-        <w:tabs>
-          <w:tab w:val="left" w:pos="2790"/>
-          <w:tab w:val="left" w:pos="2970"/>
-          <w:tab w:val="left" w:pos="3402"/>
-          <w:tab w:val="left" w:leader="dot" w:pos="8221"/>
-        </w:tabs>
-        <w:spacing w:after="0" w:line="360" w:lineRule="auto"/>
-        <w:ind w:left="567" w:right="425" w:hanging="297"/>
-        <w:jc w:val="both"/>
-        <w:rPr>
-          <w:rFonts w:ascii="Times New Roman" w:hAnsi="Times New Roman"/>
-          <w:bCs/>
-          <w:sz w:val="24"/>
-          <w:szCs w:val="24"/>
-          <w:lang w:val="en-US"/>
-        </w:rPr>
-      </w:pPr>
-      <w:r>
-        <w:rPr>
-          <w:rFonts w:ascii="Times New Roman" w:hAnsi="Times New Roman"/>
-          <w:bCs/>
-          <w:sz w:val="24"/>
-          <w:szCs w:val="24"/>
-        </w:rPr>
-        <w:t>NIM</w:t>
-      </w:r>
-      <w:r>
-        <w:rPr>
-          <w:rFonts w:ascii="Times New Roman" w:hAnsi="Times New Roman"/>
-          <w:bCs/>
-          <w:sz w:val="24"/>
-          <w:szCs w:val="24"/>
-        </w:rPr>
-        <w:tab/>
-        <w:t>:</w:t>
-      </w:r>
-      <w:r>
-        <w:rPr>
-          <w:rFonts w:ascii="Times New Roman" w:hAnsi="Times New Roman"/>
-          <w:bCs/>
-          <w:sz w:val="24"/>
-          <w:szCs w:val="24"/>
-        </w:rPr>
-        <w:tab/>
-      </w:r>
-      <w:r>
-        <w:rPr>
-          <w:rFonts w:ascii="Times New Roman" w:hAnsi="Times New Roman"/>
-          <w:sz w:val="24"/>
-          <w:szCs w:val="24"/>
-          <w:lang w:val="en-US"/>
-        </w:rPr>
-        <w:t>${nim}</w:t>
-      </w:r>
-    </w:p>
-    <w:p>
-      <w:pPr>
-        <w:tabs>
-          <w:tab w:val="left" w:pos="2790"/>
-          <w:tab w:val="left" w:pos="2970"/>
-          <w:tab w:val="left" w:pos="3402"/>
-          <w:tab w:val="left" w:leader="dot" w:pos="8221"/>
-        </w:tabs>
-        <w:spacing w:after="0" w:line="360" w:lineRule="auto"/>
-        <w:ind w:left="2970" w:right="425" w:hanging="2700"/>
-        <w:jc w:val="both"/>
-        <w:rPr>
-          <w:rFonts w:ascii="Times New Roman" w:hAnsi="Times New Roman"/>
-          <w:sz w:val="24"/>
-          <w:szCs w:val="24"/>
-          <w:lang w:val="en-US"/>
-        </w:rPr>
-      </w:pPr>
-      <w:r>
-        <w:rPr>
-          <w:rFonts w:ascii="Times New Roman" w:hAnsi="Times New Roman"/>
-          <w:bCs/>
-          <w:sz w:val="24"/>
-          <w:szCs w:val="24"/>
-        </w:rPr>
-        <w:t xml:space="preserve">Judul </w:t>
-      </w:r>
-      <w:r>
-        <w:rPr>
-          <w:rFonts w:ascii="Times New Roman" w:hAnsi="Times New Roman"/>
-          <w:bCs/>
-          <w:sz w:val="24"/>
-          <w:szCs w:val="24"/>
-        </w:rPr>
-        <w:t>Proposal</w:t>
-      </w:r>
-      <w:r>
-        <w:rPr>
-          <w:rFonts w:ascii="Times New Roman" w:hAnsi="Times New Roman"/>
-          <w:bCs/>
-          <w:sz w:val="24"/>
-          <w:szCs w:val="24"/>
-        </w:rPr>
-        <w:tab/>
-        <w:t>:</w:t>
-      </w:r>
-      <w:r>
-        <w:rPr>
-          <w:rFonts w:ascii="Times New Roman" w:hAnsi="Times New Roman"/>
-          <w:bCs/>
-          <w:sz w:val="24"/>
-          <w:szCs w:val="24"/>
-        </w:rPr>
-        <w:tab/>
-      </w:r>
-      <w:r>
-        <w:rPr>
-          <w:rFonts w:ascii="Times New Roman" w:hAnsi="Times New Roman"/>
-          <w:sz w:val="24"/>
-          <w:szCs w:val="24"/>
-          <w:lang w:val="en-US"/>
-        </w:rPr>
-        <w:t>${</w:t>
-      </w:r>
-      <w:proofErr w:type="spellStart"/>
-      <w:r>
-        <w:rPr>
-          <w:rFonts w:ascii="Times New Roman" w:hAnsi="Times New Roman"/>
-          <w:sz w:val="24"/>
-          <w:szCs w:val="24"/>
-          <w:lang w:val="en-US"/>
-        </w:rPr>
-        <w:t>judul_proposal</w:t>
-      </w:r>
-      <w:proofErr w:type="spellEnd"/>
-      <w:r>
-        <w:rPr>
-          <w:rFonts w:ascii="Times New Roman" w:hAnsi="Times New Roman"/>
-          <w:sz w:val="24"/>
-          <w:szCs w:val="24"/>
-          <w:lang w:val="en-US"/>
-        </w:rPr>
-        <w:t>}</w:t>
-      </w:r>
-    </w:p>
-    <w:p>
-      <w:pPr>
-        <w:tabs>
-          <w:tab w:val="left" w:pos="2790"/>
-          <w:tab w:val="left" w:pos="2970"/>
-          <w:tab w:val="left" w:pos="3402"/>
-          <w:tab w:val="left" w:leader="dot" w:pos="8221"/>
-        </w:tabs>
-        <w:spacing w:after="0" w:line="360" w:lineRule="auto"/>
-        <w:ind w:left="2970" w:right="425" w:hanging="2700"/>
-        <w:jc w:val="both"/>
-        <w:rPr>
-          <w:rFonts w:ascii="Times New Roman" w:hAnsi="Times New Roman"/>
-          <w:sz w:val="24"/>
-          <w:szCs w:val="24"/>
-        </w:rPr>
-      </w:pPr>
-      <w:r>
-        <w:rPr>
-          <w:rFonts w:ascii="Times New Roman" w:hAnsi="Times New Roman"/>
-          <w:bCs/>
-          <w:sz w:val="24"/>
-          <w:szCs w:val="24"/>
-        </w:rPr>
-        <w:t>Waktu</w:t>
-      </w:r>
-      <w:r>
-        <w:rPr>
-          <w:rFonts w:ascii="Times New Roman" w:hAnsi="Times New Roman"/>
-          <w:bCs/>
-          <w:sz w:val="24"/>
-          <w:szCs w:val="24"/>
-        </w:rPr>
-        <w:tab/>
-        <w:t>:</w:t>
-      </w:r>
-      <w:r>
-        <w:rPr>
-          <w:rFonts w:ascii="Times New Roman" w:hAnsi="Times New Roman"/>
-          <w:bCs/>
-          <w:sz w:val="24"/>
-          <w:szCs w:val="24"/>
-        </w:rPr>
-        <w:tab/>
-      </w:r>
-      <w:r>
-        <w:rPr>
-          <w:rFonts w:ascii="Times New Roman" w:hAnsi="Times New Roman"/>
-          <w:sz w:val="24"/>
-          <w:szCs w:val="24"/>
-          <w:lang w:val="en-US"/>
-        </w:rPr>
-        <w:t>${</w:t>
-      </w:r>
-      <w:proofErr w:type="spellStart"/>
-      <w:r>
-        <w:rPr>
-          <w:rFonts w:ascii="Times New Roman" w:hAnsi="Times New Roman"/>
-          <w:sz w:val="24"/>
-          <w:szCs w:val="24"/>
-          <w:lang w:val="en-US"/>
-        </w:rPr>
-        <w:t>waktu</w:t>
-      </w:r>
-      <w:proofErr w:type="spellEnd"/>
-      <w:r>
-        <w:rPr>
-          <w:rFonts w:ascii="Times New Roman" w:hAnsi="Times New Roman"/>
-          <w:sz w:val="24"/>
-          <w:szCs w:val="24"/>
-          <w:lang w:val="en-US"/>
-        </w:rPr>
-        <w:t>}</w:t>
-      </w:r>
-    </w:p>
-    <w:p>
-      <w:pPr>
-        <w:tabs>
-          <w:tab w:val="left" w:pos="2790"/>
-          <w:tab w:val="left" w:pos="2970"/>
-          <w:tab w:val="left" w:pos="3402"/>
-          <w:tab w:val="left" w:leader="dot" w:pos="8221"/>
-        </w:tabs>
-        <w:spacing w:after="240" w:line="360" w:lineRule="auto"/>
-        <w:ind w:left="567" w:right="425" w:hanging="297"/>
-        <w:rPr>
-          <w:rFonts w:ascii="Times New Roman" w:eastAsia="Times New Roman" w:hAnsi="Times New Roman"/>
-          <w:lang w:val="en-US"/>
-        </w:rPr>
-      </w:pPr>
-      <w:r>
-        <w:rPr>
-          <w:rFonts w:ascii="Times New Roman" w:hAnsi="Times New Roman"/>
-          <w:sz w:val="24"/>
-          <w:szCs w:val="24"/>
-        </w:rPr>
-        <w:t>Tempat</w:t>
-      </w:r>
-      <w:r>
-        <w:rPr>
-          <w:rFonts w:ascii="Times New Roman" w:hAnsi="Times New Roman"/>
-          <w:sz w:val="24"/>
-          <w:szCs w:val="24"/>
-        </w:rPr>
-        <w:tab/>
-        <w:t>:</w:t>
-      </w:r>
-      <w:r>
-        <w:rPr>
-          <w:rFonts w:ascii="Times New Roman" w:hAnsi="Times New Roman"/>
-          <w:sz w:val="24"/>
-          <w:szCs w:val="24"/>
-        </w:rPr>
-        <w:tab/>
-      </w:r>
-      <w:r>
-        <w:rPr>
-          <w:rFonts w:ascii="Times New Roman" w:hAnsi="Times New Roman"/>
-          <w:sz w:val="24"/>
-          <w:szCs w:val="24"/>
-          <w:lang w:val="en-US"/>
-        </w:rPr>
-        <w:t>${</w:t>
-      </w:r>
-      <w:proofErr w:type="spellStart"/>
-      <w:r>
-        <w:rPr>
-          <w:rFonts w:ascii="Times New Roman" w:hAnsi="Times New Roman"/>
-          <w:sz w:val="24"/>
-          <w:szCs w:val="24"/>
-          <w:lang w:val="en-US"/>
-        </w:rPr>
-        <w:t>tempat</w:t>
-      </w:r>
-      <w:proofErr w:type="spellEnd"/>
-      <w:r>
-        <w:rPr>
-          <w:rFonts w:ascii="Times New Roman" w:hAnsi="Times New Roman"/>
-          <w:sz w:val="24"/>
-          <w:szCs w:val="24"/>
-          <w:lang w:val="en-US"/>
-        </w:rPr>
-        <w:t>}</w:t>
-      </w:r>
-    </w:p>
-    <w:p>
-      <w:pPr>
-        <w:tabs>
-          <w:tab w:val="left" w:pos="2790"/>
-          <w:tab w:val="left" w:pos="2970"/>
-          <w:tab w:val="left" w:pos="3402"/>
-          <w:tab w:val="left" w:leader="dot" w:pos="8221"/>
-        </w:tabs>
-        <w:spacing w:after="240" w:line="240" w:lineRule="auto"/>
-        <w:ind w:left="576" w:right="432" w:hanging="302"/>
-        <w:rPr>
-          <w:rFonts w:ascii="Times New Roman" w:eastAsia="Times New Roman" w:hAnsi="Times New Roman"/>
-          <w:lang w:val="en-US"/>
-        </w:rPr>
-      </w:pPr>
-      <w:r>
-        <w:rPr>
-          <w:rFonts w:ascii="Times New Roman" w:hAnsi="Times New Roman"/>
-          <w:noProof/>
-          <w:color w:val="000000"/>
-          <w:lang w:val="en-US"/>
-        </w:rPr>
-        <w:pict w14:anchorId="083FC1C9">
-          <v:shape id="Picture 5" o:spid="_x0000_s1059" type="#_x0000_t75" style="position:absolute;left:0;text-align:left;margin-left:-36.2pt;margin-top:26.85pt;width:36pt;height:401.25pt;z-index:8;visibility:visible">
-            <v:imagedata r:id="rId8" o:title="" croptop="36095f" cropleft="1086f" cropright="61123f"/>
+          <v:shape id="Picture 5" o:spid="_x0000_s1059" type="#_x0000_t75" style="position:absolute;left:0;text-align:left;margin-left:-36.2pt;margin-top:26.85pt;width:36pt;height:401.25pt;z-index:3;visibility:visible">
+            <v:imagedata r:id="rId6" o:title="" croptop="36095f" cropleft="1086f" cropright="61123f"/>
           </v:shape>
         </w:pict>
       </w:r>
@@ -2097,7 +1775,7 @@
         </w:rPr>
         <w:pict w14:anchorId="10F9F737">
           <v:shape id="_x0000_s1062" type="#_x0000_t75" style="position:absolute;left:0;text-align:left;margin-left:473.65pt;margin-top:42.7pt;width:51pt;height:43.5pt;z-index:-1" wrapcoords="15882 372 5400 2607 0 4469 -318 10800 3812 18248 4129 21228 16518 21228 17471 18248 21282 11917 21282 9310 20965 6331 17471 372 15882 372">
-            <v:imagedata r:id="rId9" o:title=""/>
+            <v:imagedata r:id="rId7" o:title=""/>
             <w10:wrap type="tight"/>
           </v:shape>
         </w:pict>
@@ -2140,7 +1818,7 @@
           <w:noProof/>
         </w:rPr>
         <w:pict w14:anchorId="608DBF7D">
-          <v:rect id="_x0000_s1058" style="position:absolute;left:0;text-align:left;margin-left:-91.55pt;margin-top:279.15pt;width:21pt;height:435.75pt;z-index:7;visibility:visible;mso-position-horizontal-relative:text;mso-position-vertical-relative:text;mso-width-relative:margin;mso-height-relative:margin;v-text-anchor:middle" o:gfxdata="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" fillcolor="#003f77" stroked="f" strokeweight="2pt">
+          <v:rect id="_x0000_s1058" style="position:absolute;left:0;text-align:left;margin-left:-91.55pt;margin-top:279.15pt;width:21pt;height:435.75pt;z-index:2;visibility:visible;mso-position-horizontal-relative:text;mso-position-vertical-relative:text;mso-width-relative:margin;mso-height-relative:margin;v-text-anchor:middle" o:gfxdata="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" fillcolor="#003f77" stroked="f" strokeweight="2pt">
             <v:fill color2="#0072ce" rotate="t" angle="180" colors="0 #003f77;.5 #005fad;1 #0072ce" focus="100%" type="gradient"/>
           </v:rect>
         </w:pict>
@@ -2150,7 +1828,7 @@
           <w:noProof/>
         </w:rPr>
         <w:pict w14:anchorId="38F7F554">
-          <v:rect id="_x0000_s1046" style="position:absolute;left:0;text-align:left;margin-left:-91.55pt;margin-top:279.15pt;width:21pt;height:435.75pt;z-index:6;visibility:visible;mso-position-horizontal-relative:text;mso-position-vertical-relative:text;mso-width-relative:margin;mso-height-relative:margin;v-text-anchor:middle" o:gfxdata="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" fillcolor="#003f77" stroked="f" strokeweight="2pt">
+          <v:rect id="_x0000_s1046" style="position:absolute;left:0;text-align:left;margin-left:-91.55pt;margin-top:279.15pt;width:21pt;height:435.75pt;z-index:1;visibility:visible;mso-position-horizontal-relative:text;mso-position-vertical-relative:text;mso-width-relative:margin;mso-height-relative:margin;v-text-anchor:middle" o:gfxdata="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" fillcolor="#003f77" stroked="f" strokeweight="2pt">
             <v:fill color2="#0072ce" rotate="t" angle="180" colors="0 #003f77;.5 #005fad;1 #0072ce" focus="100%" type="gradient"/>
           </v:rect>
         </w:pict>
@@ -2167,7 +1845,7 @@
 </file>
 
 <file path=word/numbering.xml><?xml version="1.0" encoding="utf-8"?>
-<w:numbering xmlns:wpc="http://schemas.microsoft.com/office/word/2010/wordprocessingCanvas" xmlns:cx="http://schemas.microsoft.com/office/drawing/2014/chartex" xmlns:cx1="http://schemas.microsoft.com/office/drawing/2015/9/8/chartex" xmlns:cx2="http://schemas.microsoft.com/office/drawing/2015/10/21/chartex" xmlns:cx3="http://schemas.microsoft.com/office/drawing/2016/5/9/chartex" xmlns:cx4="http://schemas.microsoft.com/office/drawing/2016/5/10/chartex" xmlns:cx5="http://schemas.microsoft.com/office/drawing/2016/5/11/chartex" xmlns:cx6="http://schemas.microsoft.com/office/drawing/2016/5/12/chartex" xmlns:cx7="http://schemas.microsoft.com/office/drawing/2016/5/13/chartex" xmlns:cx8="http://schemas.microsoft.com/office/drawing/2016/5/14/chartex" xmlns:mc="http://schemas.openxmlformats.org/markup-compatibility/2006" xmlns:aink="http://schemas.microsoft.com/office/drawing/2016/ink" xmlns:am3d="http://schemas.microsoft.com/office/drawing/2017/model3d" xmlns:o="urn:schemas-microsoft-com:office:office" xmlns:oel="http://schemas.microsoft.com/office/2019/extlst" xmlns:r="http://schemas.openxmlformats.org/officeDocument/2006/relationships" xmlns:m="http://schemas.openxmlformats.org/officeDocument/2006/math" xmlns:v="urn:schemas-microsoft-com:vml" xmlns:wp14="http://schemas.microsoft.com/office/word/2010/wordprocessingDrawing" xmlns:wp="http://schemas.openxmlformats.org/drawingml/2006/wordprocessingDrawing" xmlns:w10="urn:schemas-microsoft-com:office:word" xmlns:w="http://schemas.openxmlformats.org/wordprocessingml/2006/main" xmlns:w14="http://schemas.microsoft.com/office/word/2010/wordml" xmlns:w15="http://schemas.microsoft.com/office/word/2012/wordml" xmlns:w16cei="http://schemas.microsoft.com/office/word/2026/wordml/cei" xmlns:w16cex="http://schemas.microsoft.com/office/word/2018/wordml/cex" xmlns:w16cid="http://schemas.microsoft.com/office/word/2016/wordml/cid" xmlns:w16="http://schemas.microsoft.com/office/word/2018/wordml" xmlns:w16du="http://schemas.microsoft.com/office/word/2023/wordml/word16du" xmlns:w16sdtdh="http://schemas.microsoft.com/office/word/2020/wordml/sdtdatahash" xmlns:w16sdtfl="http://schemas.microsoft.com/office/word/2024/wordml/sdtformatlock" xmlns:w16se="http://schemas.microsoft.com/office/word/2015/wordml/symex" xmlns:wpg="http://schemas.microsoft.com/office/word/2010/wordprocessingGroup" xmlns:wpi="http://schemas.microsoft.com/office/word/2010/wordprocessingInk" xmlns:wne="http://schemas.microsoft.com/office/word/2006/wordml" xmlns:wps="http://schemas.microsoft.com/office/word/2010/wordprocessingShape" mc:Ignorable="w14 w15 w16se w16cid w16 w16cex w16sdtdh w16sdtfl w16du wp14">
+<w:numbering xmlns:wpc="http://schemas.microsoft.com/office/word/2010/wordprocessingCanvas" xmlns:cx="http://schemas.microsoft.com/office/drawing/2014/chartex" xmlns:cx1="http://schemas.microsoft.com/office/drawing/2015/9/8/chartex" xmlns:cx2="http://schemas.microsoft.com/office/drawing/2015/10/21/chartex" xmlns:cx3="http://schemas.microsoft.com/office/drawing/2016/5/9/chartex" xmlns:cx4="http://schemas.microsoft.com/office/drawing/2016/5/10/chartex" xmlns:cx5="http://schemas.microsoft.com/office/drawing/2016/5/11/chartex" xmlns:cx6="http://schemas.microsoft.com/office/drawing/2016/5/12/chartex" xmlns:cx7="http://schemas.microsoft.com/office/drawing/2016/5/13/chartex" xmlns:cx8="http://schemas.microsoft.com/office/drawing/2016/5/14/chartex" xmlns:mc="http://schemas.openxmlformats.org/markup-compatibility/2006" xmlns:aink="http://schemas.microsoft.com/office/drawing/2016/ink" xmlns:am3d="http://schemas.microsoft.com/office/drawing/2017/model3d" xmlns:o="urn:schemas-microsoft-com:office:office" xmlns:oel="http://schemas.microsoft.com/office/2019/extlst" xmlns:r="http://schemas.openxmlformats.org/officeDocument/2006/relationships" xmlns:m="http://schemas.openxmlformats.org/officeDocument/2006/math" xmlns:v="urn:schemas-microsoft-com:vml" xmlns:wp14="http://schemas.microsoft.com/office/word/2010/wordprocessingDrawing" xmlns:wp="http://schemas.openxmlformats.org/drawingml/2006/wordprocessingDrawing" xmlns:w10="urn:schemas-microsoft-com:office:word" xmlns:w="http://schemas.openxmlformats.org/wordprocessingml/2006/main" xmlns:w14="http://schemas.microsoft.com/office/word/2010/wordml" xmlns:w15="http://schemas.microsoft.com/office/word/2012/wordml" xmlns:w16cex="http://schemas.microsoft.com/office/word/2018/wordml/cex" xmlns:w16cid="http://schemas.microsoft.com/office/word/2016/wordml/cid" xmlns:w16="http://schemas.microsoft.com/office/word/2018/wordml" xmlns:w16du="http://schemas.microsoft.com/office/word/2023/wordml/word16du" xmlns:w16sdtdh="http://schemas.microsoft.com/office/word/2020/wordml/sdtdatahash" xmlns:w16sdtfl="http://schemas.microsoft.com/office/word/2024/wordml/sdtformatlock" xmlns:w16se="http://schemas.microsoft.com/office/word/2015/wordml/symex" xmlns:wpg="http://schemas.microsoft.com/office/word/2010/wordprocessingGroup" xmlns:wpi="http://schemas.microsoft.com/office/word/2010/wordprocessingInk" xmlns:wne="http://schemas.microsoft.com/office/word/2006/wordml" xmlns:wps="http://schemas.microsoft.com/office/word/2010/wordprocessingShape" mc:Ignorable="w14 w15 w16se w16cid w16 w16cex w16sdtdh w16sdtfl w16du wp14">
   <w:abstractNum w:abstractNumId="0" w15:restartNumberingAfterBreak="0">
     <w:nsid w:val="160025B6"/>
     <w:multiLevelType w:val="hybridMultilevel"/>

</xml_diff>